<commit_message>
bugfix: Fix brief variant to keep all positions and use whitespace
Brief was dropping positions (only 4) and stripping the entire
Technical Skills section, leaving unused whitespace. Fixed:
- Keep all positions from type config, 1 bullet each (Siege: 2)
- Compact competencies: category names with sub-category names only
- Strip project technologies/impact (description only)

All 56 legibility tests pass, all briefs <=2 pages.

Refs: #16
</commit_message>
<xml_diff>
--- a/outputs/ats/comprehensive/brief/cartographic_professional/docx/dheeraj_chand_comprehensive_brief_cartographic_professional.docx
+++ b/outputs/ats/comprehensive/brief/cartographic_professional/docx/dheeraj_chand_comprehensive_brief_cartographic_professional.docx
@@ -33,6 +33,19 @@
     <w:p>
       <w:r>
         <w:t>I've spent 20+ years at the intersection of geography, demographics, and software — building systems that help people understand who lives where, why it matters, and what to do about it. I found systematic race coding errors in national voter files that nobody else had caught.</w:t>
+      </w:r>
+    </w:p>
+    <w:p>
+      <w:pPr>
+        <w:pStyle w:val="Heading2"/>
+      </w:pPr>
+      <w:r>
+        <w:t>CORE COMPETENCIES</w:t>
+      </w:r>
+    </w:p>
+    <w:p>
+      <w:r>
+        <w:t>Programming and Development • Geospatial Technologies • Machine Learning &amp; AI • Data Infrastructure • Cloud &amp; DevOps</w:t>
       </w:r>
     </w:p>
     <w:p>
@@ -159,6 +172,124 @@
     </w:p>
     <w:p>
       <w:pPr>
+        <w:pStyle w:val="Heading3"/>
+      </w:pPr>
+      <w:r>
+        <w:t>Senior Analyst - Myers Research (Austin, TX) | 2012 - 2014</w:t>
+      </w:r>
+    </w:p>
+    <w:p>
+      <w:r>
+        <w:t>Political Research &amp; Analysis</w:t>
+      </w:r>
+    </w:p>
+    <w:p>
+      <w:r>
+        <w:t>• Designed survey instruments for specialized voting segments and niche markets</w:t>
+      </w:r>
+    </w:p>
+    <w:p>
+      <w:pPr>
+        <w:pStyle w:val="Heading3"/>
+      </w:pPr>
+      <w:r>
+        <w:t>Research Director - PCCC (Washington, DC) | August 2011 - August 2012</w:t>
+      </w:r>
+    </w:p>
+    <w:p>
+      <w:r>
+        <w:t>Political Research &amp; Data Analysis</w:t>
+      </w:r>
+    </w:p>
+    <w:p>
+      <w:r>
+        <w:t xml:space="preserve">• Conceived and built FLEEM — a Twilio-based web application emulating a predictive dialer for regulated political surveys, handling </w:t>
+      </w:r>
+      <w:r>
+        <w:rPr>
+          <w:b/>
+          <w:color w:val="2C3E50"/>
+        </w:rPr>
+        <w:t>10,000</w:t>
+      </w:r>
+      <w:r>
+        <w:t>+ simultaneous calls</w:t>
+      </w:r>
+    </w:p>
+    <w:p>
+      <w:pPr>
+        <w:pStyle w:val="Heading3"/>
+      </w:pPr>
+      <w:r>
+        <w:t>Field Director - The Feldman Group (Washington, DC) | 2011 - 2012</w:t>
+      </w:r>
+    </w:p>
+    <w:p>
+      <w:r>
+        <w:t>Political Research</w:t>
+      </w:r>
+    </w:p>
+    <w:p>
+      <w:r>
+        <w:t>• Managed survey fielding for a multi-million dollar research firm — scheduling, oversight, sampling, and quality control</w:t>
+      </w:r>
+    </w:p>
+    <w:p>
+      <w:pPr>
+        <w:pStyle w:val="Heading3"/>
+      </w:pPr>
+      <w:r>
+        <w:t>Software Engineer - Salsa Labs (Washington, DC) | January 2011 - August 2011</w:t>
+      </w:r>
+    </w:p>
+    <w:p>
+      <w:r>
+        <w:t>Political Technology &amp; CRM Systems</w:t>
+      </w:r>
+    </w:p>
+    <w:p>
+      <w:r>
+        <w:t>• Built geospatial analysis and mapping tools for a political CRM platform serving progressive campaigns</w:t>
+      </w:r>
+    </w:p>
+    <w:p>
+      <w:pPr>
+        <w:pStyle w:val="Heading3"/>
+      </w:pPr>
+      <w:r>
+        <w:t>Interim Technology Manager - The Praxis Project (Washington, DC) | April 2009 - October 2009</w:t>
+      </w:r>
+    </w:p>
+    <w:p>
+      <w:r>
+        <w:t>Public Health Technology</w:t>
+      </w:r>
+    </w:p>
+    <w:p>
+      <w:r>
+        <w:t>• Managed technology infrastructure for a public health advocacy organization</w:t>
+      </w:r>
+    </w:p>
+    <w:p>
+      <w:pPr>
+        <w:pStyle w:val="Heading3"/>
+      </w:pPr>
+      <w:r>
+        <w:t>Programmer - Lake Research Partners (Austin, TX) | 2008</w:t>
+      </w:r>
+    </w:p>
+    <w:p>
+      <w:r>
+        <w:t>Political Polling &amp; Research</w:t>
+      </w:r>
+    </w:p>
+    <w:p>
+      <w:r>
+        <w:t>• Pioneered integration of choropleths and hexagonal grid maps into standard polling reports — the firm had never used spatial visualization before</w:t>
+      </w:r>
+    </w:p>
+    <w:p>
+      <w:pPr>
         <w:pStyle w:val="Heading2"/>
       </w:pPr>
       <w:r>
@@ -179,16 +310,6 @@
       </w:r>
     </w:p>
     <w:p>
-      <w:r>
-        <w:t>Technologies: Python, GeoDjango, PostGIS, PySpark, Apache Sedona, Databricks, Hydra, Pydantic, Snowflake, Census API</w:t>
-      </w:r>
-    </w:p>
-    <w:p>
-      <w:r>
-        <w:t>Impact: Foundation infrastructure for all Siege Analytics projects — every analysis pipeline and data product depends on it. Demonstrates commitment to open-source and rigorous engineering practices.</w:t>
-      </w:r>
-    </w:p>
-    <w:p>
       <w:pPr>
         <w:pStyle w:val="Heading3"/>
       </w:pPr>
@@ -199,16 +320,6 @@
     <w:p>
       <w:r>
         <w:t>Cloud-based GeoDjango platform for redistricting analysis with real-time collaborative editing and Census integration, used by 12,847 analysts across 89 organizations during the 2021 redistricting cycle.</w:t>
-      </w:r>
-    </w:p>
-    <w:p>
-      <w:r>
-        <w:t>Technologies: GeoDjango, PostGIS, AWS, Docker, React, Python, Redis, WebSockets</w:t>
-      </w:r>
-    </w:p>
-    <w:p>
-      <w:r>
-        <w:t>Impact: Reduced mapping costs by 73.5%, saving organizations $4.7M. Made redistricting analysis accessible to organizations that previously couldn't afford it.</w:t>
       </w:r>
     </w:p>
     <w:p>
@@ -275,6 +386,39 @@
       </w:r>
       <w:r>
         <w:t xml:space="preserve"> and making redistricting analysis accessible to organizations that couldn't previously afford it.</w:t>
+      </w:r>
+    </w:p>
+    <w:p>
+      <w:pPr>
+        <w:pStyle w:val="Heading2"/>
+      </w:pPr>
+      <w:r>
+        <w:t>TECHNICAL SKILLS</w:t>
+      </w:r>
+    </w:p>
+    <w:p>
+      <w:r>
+        <w:t>PROGRAMMING AND DEVELOPMENT Python, R, SQL/PostGIS, JavaScript, Java, Other Technologies</w:t>
+      </w:r>
+    </w:p>
+    <w:p>
+      <w:r>
+        <w:t>GEOSPATIAL TECHNOLOGIES Databases, Analysis Tools, Web Mapping, Processing, Library</w:t>
+      </w:r>
+    </w:p>
+    <w:p>
+      <w:r>
+        <w:t>MACHINE LEARNING &amp; AI ML Frameworks, Geospatial ML, Techniques, Validation</w:t>
+      </w:r>
+    </w:p>
+    <w:p>
+      <w:r>
+        <w:t>DATA INFRASTRUCTURE Processing, Pipelines, Storage, Streaming</w:t>
+      </w:r>
+    </w:p>
+    <w:p>
+      <w:r>
+        <w:t>CLOUD &amp; DEVOPS AWS, Containerization, Monitoring, CI/CD</w:t>
       </w:r>
     </w:p>
     <w:p>

</xml_diff>